<commit_message>
First draft after long time
</commit_message>
<xml_diff>
--- a/FATI_WordGenerator/Resources/RechnungTemplate.docx
+++ b/FATI_WordGenerator/Resources/RechnungTemplate.docx
@@ -706,7 +706,253 @@
         <w:rPr>
           <w:rFonts w:ascii="Arial" w:eastAsiaTheme="minorHAnsi" w:hAnsi="Arial" w:cs="Arial"/>
           <w:b/>
-          <w:bCs/>
+          <w:kern w:val="0"/>
+          <w:sz w:val="20"/>
+          <w:szCs w:val="20"/>
+        </w:rPr>
+      </w:pPr>
+    </w:p>
+    <w:p>
+      <w:pPr>
+        <w:tabs>
+          <w:tab w:val="left" w:pos="6096"/>
+          <w:tab w:val="right" w:pos="9214"/>
+        </w:tabs>
+        <w:suppressAutoHyphens w:val="0"/>
+        <w:autoSpaceDE w:val="0"/>
+        <w:adjustRightInd w:val="0"/>
+        <w:spacing w:after="0" w:line="240" w:lineRule="auto"/>
+        <w:rPr>
+          <w:rFonts w:ascii="Arial" w:eastAsiaTheme="minorHAnsi" w:hAnsi="Arial" w:cs="Arial"/>
+          <w:b/>
+          <w:kern w:val="0"/>
+          <w:sz w:val="20"/>
+          <w:szCs w:val="20"/>
+        </w:rPr>
+      </w:pPr>
+    </w:p>
+    <w:p>
+      <w:pPr>
+        <w:tabs>
+          <w:tab w:val="left" w:pos="6096"/>
+          <w:tab w:val="right" w:pos="9214"/>
+        </w:tabs>
+        <w:suppressAutoHyphens w:val="0"/>
+        <w:autoSpaceDE w:val="0"/>
+        <w:adjustRightInd w:val="0"/>
+        <w:spacing w:after="0" w:line="240" w:lineRule="auto"/>
+        <w:rPr>
+          <w:rFonts w:ascii="Arial" w:eastAsiaTheme="minorHAnsi" w:hAnsi="Arial" w:cs="Arial"/>
+          <w:b/>
+          <w:kern w:val="0"/>
+          <w:sz w:val="20"/>
+          <w:szCs w:val="20"/>
+        </w:rPr>
+      </w:pPr>
+    </w:p>
+    <w:p>
+      <w:pPr>
+        <w:tabs>
+          <w:tab w:val="left" w:pos="6096"/>
+          <w:tab w:val="right" w:pos="9214"/>
+        </w:tabs>
+        <w:suppressAutoHyphens w:val="0"/>
+        <w:autoSpaceDE w:val="0"/>
+        <w:adjustRightInd w:val="0"/>
+        <w:spacing w:after="0" w:line="240" w:lineRule="auto"/>
+        <w:rPr>
+          <w:rFonts w:ascii="Arial" w:eastAsiaTheme="minorHAnsi" w:hAnsi="Arial" w:cs="Arial"/>
+          <w:b/>
+          <w:kern w:val="0"/>
+          <w:sz w:val="20"/>
+          <w:szCs w:val="20"/>
+        </w:rPr>
+      </w:pPr>
+    </w:p>
+    <w:p>
+      <w:pPr>
+        <w:tabs>
+          <w:tab w:val="left" w:pos="6096"/>
+          <w:tab w:val="right" w:pos="9214"/>
+        </w:tabs>
+        <w:suppressAutoHyphens w:val="0"/>
+        <w:autoSpaceDE w:val="0"/>
+        <w:adjustRightInd w:val="0"/>
+        <w:spacing w:after="0" w:line="240" w:lineRule="auto"/>
+        <w:rPr>
+          <w:rFonts w:ascii="Arial" w:eastAsiaTheme="minorHAnsi" w:hAnsi="Arial" w:cs="Arial"/>
+          <w:b/>
+          <w:kern w:val="0"/>
+          <w:sz w:val="20"/>
+          <w:szCs w:val="20"/>
+        </w:rPr>
+      </w:pPr>
+    </w:p>
+    <w:p>
+      <w:pPr>
+        <w:tabs>
+          <w:tab w:val="left" w:pos="6096"/>
+          <w:tab w:val="right" w:pos="9214"/>
+        </w:tabs>
+        <w:suppressAutoHyphens w:val="0"/>
+        <w:autoSpaceDE w:val="0"/>
+        <w:adjustRightInd w:val="0"/>
+        <w:spacing w:after="0" w:line="240" w:lineRule="auto"/>
+        <w:rPr>
+          <w:rFonts w:ascii="Arial" w:eastAsiaTheme="minorHAnsi" w:hAnsi="Arial" w:cs="Arial"/>
+          <w:b/>
+          <w:kern w:val="0"/>
+          <w:sz w:val="20"/>
+          <w:szCs w:val="20"/>
+        </w:rPr>
+      </w:pPr>
+    </w:p>
+    <w:p>
+      <w:pPr>
+        <w:tabs>
+          <w:tab w:val="left" w:pos="6096"/>
+          <w:tab w:val="right" w:pos="9214"/>
+        </w:tabs>
+        <w:suppressAutoHyphens w:val="0"/>
+        <w:autoSpaceDE w:val="0"/>
+        <w:adjustRightInd w:val="0"/>
+        <w:spacing w:after="0" w:line="240" w:lineRule="auto"/>
+        <w:rPr>
+          <w:rFonts w:ascii="Arial" w:eastAsiaTheme="minorHAnsi" w:hAnsi="Arial" w:cs="Arial"/>
+          <w:b/>
+          <w:kern w:val="0"/>
+          <w:sz w:val="20"/>
+          <w:szCs w:val="20"/>
+        </w:rPr>
+      </w:pPr>
+    </w:p>
+    <w:p>
+      <w:pPr>
+        <w:tabs>
+          <w:tab w:val="left" w:pos="6096"/>
+          <w:tab w:val="right" w:pos="9214"/>
+        </w:tabs>
+        <w:suppressAutoHyphens w:val="0"/>
+        <w:autoSpaceDE w:val="0"/>
+        <w:adjustRightInd w:val="0"/>
+        <w:spacing w:after="0" w:line="240" w:lineRule="auto"/>
+        <w:rPr>
+          <w:rFonts w:ascii="Arial" w:eastAsiaTheme="minorHAnsi" w:hAnsi="Arial" w:cs="Arial"/>
+          <w:b/>
+          <w:kern w:val="0"/>
+          <w:sz w:val="20"/>
+          <w:szCs w:val="20"/>
+        </w:rPr>
+      </w:pPr>
+    </w:p>
+    <w:p>
+      <w:pPr>
+        <w:tabs>
+          <w:tab w:val="left" w:pos="6096"/>
+          <w:tab w:val="right" w:pos="9214"/>
+        </w:tabs>
+        <w:suppressAutoHyphens w:val="0"/>
+        <w:autoSpaceDE w:val="0"/>
+        <w:adjustRightInd w:val="0"/>
+        <w:spacing w:after="0" w:line="240" w:lineRule="auto"/>
+        <w:rPr>
+          <w:rFonts w:ascii="Arial" w:eastAsiaTheme="minorHAnsi" w:hAnsi="Arial" w:cs="Arial"/>
+          <w:b/>
+          <w:kern w:val="0"/>
+          <w:sz w:val="20"/>
+          <w:szCs w:val="20"/>
+        </w:rPr>
+      </w:pPr>
+    </w:p>
+    <w:p>
+      <w:pPr>
+        <w:tabs>
+          <w:tab w:val="left" w:pos="6096"/>
+          <w:tab w:val="right" w:pos="9214"/>
+        </w:tabs>
+        <w:suppressAutoHyphens w:val="0"/>
+        <w:autoSpaceDE w:val="0"/>
+        <w:adjustRightInd w:val="0"/>
+        <w:spacing w:after="0" w:line="240" w:lineRule="auto"/>
+        <w:rPr>
+          <w:rFonts w:ascii="Arial" w:eastAsiaTheme="minorHAnsi" w:hAnsi="Arial" w:cs="Arial"/>
+          <w:b/>
+          <w:kern w:val="0"/>
+          <w:sz w:val="20"/>
+          <w:szCs w:val="20"/>
+        </w:rPr>
+      </w:pPr>
+    </w:p>
+    <w:p>
+      <w:pPr>
+        <w:tabs>
+          <w:tab w:val="left" w:pos="6096"/>
+          <w:tab w:val="right" w:pos="9214"/>
+        </w:tabs>
+        <w:suppressAutoHyphens w:val="0"/>
+        <w:autoSpaceDE w:val="0"/>
+        <w:adjustRightInd w:val="0"/>
+        <w:spacing w:after="0" w:line="240" w:lineRule="auto"/>
+        <w:rPr>
+          <w:rFonts w:ascii="Arial" w:eastAsiaTheme="minorHAnsi" w:hAnsi="Arial" w:cs="Arial"/>
+          <w:b/>
+          <w:kern w:val="0"/>
+          <w:sz w:val="20"/>
+          <w:szCs w:val="20"/>
+        </w:rPr>
+      </w:pPr>
+    </w:p>
+    <w:p>
+      <w:pPr>
+        <w:tabs>
+          <w:tab w:val="left" w:pos="6096"/>
+          <w:tab w:val="right" w:pos="9214"/>
+        </w:tabs>
+        <w:suppressAutoHyphens w:val="0"/>
+        <w:autoSpaceDE w:val="0"/>
+        <w:adjustRightInd w:val="0"/>
+        <w:spacing w:after="0" w:line="240" w:lineRule="auto"/>
+        <w:rPr>
+          <w:rFonts w:ascii="Arial" w:eastAsiaTheme="minorHAnsi" w:hAnsi="Arial" w:cs="Arial"/>
+          <w:b/>
+          <w:kern w:val="0"/>
+          <w:sz w:val="20"/>
+          <w:szCs w:val="20"/>
+        </w:rPr>
+      </w:pPr>
+    </w:p>
+    <w:p>
+      <w:pPr>
+        <w:tabs>
+          <w:tab w:val="left" w:pos="6096"/>
+          <w:tab w:val="right" w:pos="9214"/>
+        </w:tabs>
+        <w:suppressAutoHyphens w:val="0"/>
+        <w:autoSpaceDE w:val="0"/>
+        <w:adjustRightInd w:val="0"/>
+        <w:spacing w:after="0" w:line="240" w:lineRule="auto"/>
+        <w:rPr>
+          <w:rFonts w:ascii="Arial" w:eastAsiaTheme="minorHAnsi" w:hAnsi="Arial" w:cs="Arial"/>
+          <w:b/>
+          <w:kern w:val="0"/>
+          <w:sz w:val="20"/>
+          <w:szCs w:val="20"/>
+        </w:rPr>
+      </w:pPr>
+    </w:p>
+    <w:p>
+      <w:pPr>
+        <w:tabs>
+          <w:tab w:val="left" w:pos="6096"/>
+          <w:tab w:val="right" w:pos="9214"/>
+        </w:tabs>
+        <w:suppressAutoHyphens w:val="0"/>
+        <w:autoSpaceDE w:val="0"/>
+        <w:adjustRightInd w:val="0"/>
+        <w:spacing w:after="0" w:line="240" w:lineRule="auto"/>
+        <w:rPr>
+          <w:rFonts w:ascii="Arial" w:eastAsiaTheme="minorHAnsi" w:hAnsi="Arial" w:cs="Arial"/>
+          <w:b/>
           <w:kern w:val="0"/>
           <w:sz w:val="20"/>
           <w:szCs w:val="20"/>
@@ -949,13 +1195,23 @@
                               <w:szCs w:val="18"/>
                             </w:rPr>
                           </w:pPr>
+                          <w:proofErr w:type="spellStart"/>
                           <w:r>
                             <w:rPr>
                               <w:rFonts w:ascii="Arial" w:hAnsi="Arial" w:cs="Arial"/>
                               <w:b/>
                               <w:color w:val="FFFFFF" w:themeColor="background1"/>
                             </w:rPr>
-                            <w:t xml:space="preserve">DGNr. </w:t>
+                            <w:t>DGNr</w:t>
+                          </w:r>
+                          <w:proofErr w:type="spellEnd"/>
+                          <w:r>
+                            <w:rPr>
+                              <w:rFonts w:ascii="Arial" w:hAnsi="Arial" w:cs="Arial"/>
+                              <w:b/>
+                              <w:color w:val="FFFFFF" w:themeColor="background1"/>
+                            </w:rPr>
+                            <w:t xml:space="preserve">. </w:t>
                           </w:r>
                           <w:r>
                             <w:rPr>
@@ -1069,6 +1325,7 @@
                               <w:szCs w:val="18"/>
                             </w:rPr>
                           </w:pPr>
+                          <w:proofErr w:type="spellStart"/>
                           <w:r>
                             <w:rPr>
                               <w:rFonts w:ascii="Arial" w:hAnsi="Arial" w:cs="Arial"/>
@@ -1079,6 +1336,7 @@
                             </w:rPr>
                             <w:t>Bankverb</w:t>
                           </w:r>
+                          <w:proofErr w:type="spellEnd"/>
                           <w:r>
                             <w:rPr>
                               <w:rFonts w:ascii="Arial" w:hAnsi="Arial" w:cs="Arial"/>
@@ -1654,7 +1912,29 @@
                               <w:sz w:val="48"/>
                               <w:szCs w:val="48"/>
                             </w:rPr>
-                            <w:t xml:space="preserve"> Ges.m.b.H.</w:t>
+                            <w:t xml:space="preserve"> </w:t>
+                          </w:r>
+                          <w:proofErr w:type="spellStart"/>
+                          <w:r>
+                            <w:rPr>
+                              <w:rFonts w:ascii="Arial" w:hAnsi="Arial" w:cs="Arial"/>
+                              <w:b/>
+                              <w:color w:val="FFFFFF" w:themeColor="background1"/>
+                              <w:sz w:val="48"/>
+                              <w:szCs w:val="48"/>
+                            </w:rPr>
+                            <w:t>Ges.m.b.H</w:t>
+                          </w:r>
+                          <w:proofErr w:type="spellEnd"/>
+                          <w:r>
+                            <w:rPr>
+                              <w:rFonts w:ascii="Arial" w:hAnsi="Arial" w:cs="Arial"/>
+                              <w:b/>
+                              <w:color w:val="FFFFFF" w:themeColor="background1"/>
+                              <w:sz w:val="48"/>
+                              <w:szCs w:val="48"/>
+                            </w:rPr>
+                            <w:t>.</w:t>
                           </w:r>
                         </w:p>
                         <w:p>
@@ -1690,6 +1970,7 @@
                             </w:rPr>
                             <w:t xml:space="preserve">0 Wien, </w:t>
                           </w:r>
+                          <w:proofErr w:type="spellStart"/>
                           <w:r>
                             <w:rPr>
                               <w:rFonts w:ascii="Arial" w:hAnsi="Arial" w:cs="Arial"/>
@@ -1698,7 +1979,18 @@
                               <w:sz w:val="28"/>
                               <w:szCs w:val="28"/>
                             </w:rPr>
-                            <w:t>Wilandplatz 1/25</w:t>
+                            <w:t>Wilandplatz</w:t>
+                          </w:r>
+                          <w:proofErr w:type="spellEnd"/>
+                          <w:r>
+                            <w:rPr>
+                              <w:rFonts w:ascii="Arial" w:hAnsi="Arial" w:cs="Arial"/>
+                              <w:b/>
+                              <w:color w:val="FFFFFF" w:themeColor="background1"/>
+                              <w:sz w:val="28"/>
+                              <w:szCs w:val="28"/>
+                            </w:rPr>
+                            <w:t xml:space="preserve"> 1/25</w:t>
                           </w:r>
                         </w:p>
                         <w:p>
@@ -2002,7 +2294,29 @@
         <w:sz w:val="48"/>
         <w:szCs w:val="48"/>
       </w:rPr>
-      <w:t>FAKTI Steinmetz &amp; Handels Ges.m.b.H.</w:t>
+      <w:t xml:space="preserve">FAKTI Steinmetz &amp; Handels </w:t>
+    </w:r>
+    <w:proofErr w:type="spellStart"/>
+    <w:r>
+      <w:rPr>
+        <w:rFonts w:ascii="Arial" w:hAnsi="Arial" w:cs="Arial"/>
+        <w:b/>
+        <w:color w:val="FFFFFF" w:themeColor="background1"/>
+        <w:sz w:val="48"/>
+        <w:szCs w:val="48"/>
+      </w:rPr>
+      <w:t>Ges.m.b.H</w:t>
+    </w:r>
+    <w:proofErr w:type="spellEnd"/>
+    <w:r>
+      <w:rPr>
+        <w:rFonts w:ascii="Arial" w:hAnsi="Arial" w:cs="Arial"/>
+        <w:b/>
+        <w:color w:val="FFFFFF" w:themeColor="background1"/>
+        <w:sz w:val="48"/>
+        <w:szCs w:val="48"/>
+      </w:rPr>
+      <w:t>.</w:t>
     </w:r>
   </w:p>
   <w:p>
@@ -2088,6 +2402,7 @@
         <w:szCs w:val="28"/>
       </w:rPr>
     </w:pPr>
+    <w:proofErr w:type="spellStart"/>
     <w:r>
       <w:rPr>
         <w:rFonts w:ascii="Arial" w:hAnsi="Arial" w:cs="Arial"/>
@@ -2096,7 +2411,18 @@
         <w:sz w:val="28"/>
         <w:szCs w:val="28"/>
       </w:rPr>
-      <w:t>Fakti_ hotmail.com</w:t>
+      <w:t>Fakti</w:t>
+    </w:r>
+    <w:proofErr w:type="spellEnd"/>
+    <w:r>
+      <w:rPr>
+        <w:rFonts w:ascii="Arial" w:hAnsi="Arial" w:cs="Arial"/>
+        <w:b/>
+        <w:color w:val="FFFFFF" w:themeColor="background1"/>
+        <w:sz w:val="28"/>
+        <w:szCs w:val="28"/>
+      </w:rPr>
+      <w:t>_ hotmail.com</w:t>
     </w:r>
   </w:p>
   <w:p>

</xml_diff>

<commit_message>
Done, ready for adjustments
</commit_message>
<xml_diff>
--- a/FATI_WordGenerator/Resources/RechnungTemplate.docx
+++ b/FATI_WordGenerator/Resources/RechnungTemplate.docx
@@ -47,75 +47,121 @@
         </w:rPr>
         <w:t>An Firma</w:t>
       </w:r>
-    </w:p>
-    <w:p>
-      <w:pPr>
-        <w:spacing w:after="0" w:line="240" w:lineRule="auto"/>
-        <w:rPr>
-          <w:rFonts w:ascii="Arial" w:hAnsi="Arial" w:cs="Arial"/>
-        </w:rPr>
-      </w:pPr>
-      <w:r>
-        <w:rPr>
-          <w:rFonts w:ascii="Arial" w:hAnsi="Arial" w:cs="Arial"/>
-        </w:rPr>
-        <w:t>ALLITECH Allgemeine</w:t>
-      </w:r>
-    </w:p>
-    <w:p>
-      <w:pPr>
-        <w:spacing w:after="0" w:line="240" w:lineRule="auto"/>
-        <w:rPr>
-          <w:rFonts w:ascii="Arial" w:hAnsi="Arial" w:cs="Arial"/>
-        </w:rPr>
-      </w:pPr>
-      <w:r>
-        <w:rPr>
-          <w:rFonts w:ascii="Arial" w:hAnsi="Arial" w:cs="Arial"/>
-        </w:rPr>
-        <w:t>Isoliertechnik GmbH</w:t>
-      </w:r>
-    </w:p>
-    <w:p>
-      <w:pPr>
-        <w:spacing w:after="0" w:line="240" w:lineRule="auto"/>
-        <w:rPr>
-          <w:rFonts w:ascii="Arial" w:hAnsi="Arial" w:cs="Arial"/>
-        </w:rPr>
-      </w:pPr>
-      <w:r>
-        <w:rPr>
-          <w:rFonts w:ascii="Arial" w:hAnsi="Arial" w:cs="Arial"/>
-        </w:rPr>
-        <w:t>Große Schiffgasse 2</w:t>
-      </w:r>
-    </w:p>
-    <w:p>
-      <w:pPr>
-        <w:spacing w:after="0" w:line="240" w:lineRule="auto"/>
-        <w:rPr>
-          <w:rFonts w:ascii="Arial" w:hAnsi="Arial" w:cs="Arial"/>
-        </w:rPr>
-      </w:pPr>
-      <w:r>
-        <w:rPr>
-          <w:rFonts w:ascii="Arial" w:hAnsi="Arial" w:cs="Arial"/>
-        </w:rPr>
-        <w:t>1020 Wien</w:t>
-      </w:r>
-    </w:p>
-    <w:p>
-      <w:pPr>
-        <w:spacing w:after="0" w:line="240" w:lineRule="auto"/>
-        <w:rPr>
-          <w:rFonts w:ascii="Arial" w:hAnsi="Arial" w:cs="Arial"/>
-        </w:rPr>
-      </w:pPr>
-      <w:r>
-        <w:rPr>
-          <w:rFonts w:ascii="Arial" w:hAnsi="Arial" w:cs="Arial"/>
-        </w:rPr>
-        <w:t>ATU: 15586603</w:t>
+      <w:r>
+        <w:rPr>
+          <w:rFonts w:ascii="Arial" w:hAnsi="Arial" w:cs="Arial"/>
+        </w:rPr>
+        <w:t>:</w:t>
+      </w:r>
+    </w:p>
+    <w:p>
+      <w:pPr>
+        <w:spacing w:after="0" w:line="240" w:lineRule="auto"/>
+        <w:rPr>
+          <w:rFonts w:ascii="Arial" w:hAnsi="Arial" w:cs="Arial"/>
+        </w:rPr>
+      </w:pPr>
+      <w:r>
+        <w:rPr>
+          <w:rFonts w:ascii="Arial" w:hAnsi="Arial" w:cs="Arial"/>
+        </w:rPr>
+        <w:t>{</w:t>
+      </w:r>
+      <w:r>
+        <w:rPr>
+          <w:rFonts w:ascii="Arial" w:hAnsi="Arial" w:cs="Arial"/>
+        </w:rPr>
+        <w:t>FIRMA</w:t>
+      </w:r>
+      <w:r>
+        <w:rPr>
+          <w:rFonts w:ascii="Arial" w:hAnsi="Arial" w:cs="Arial"/>
+        </w:rPr>
+        <w:t>}</w:t>
+      </w:r>
+    </w:p>
+    <w:p>
+      <w:pPr>
+        <w:spacing w:after="0" w:line="240" w:lineRule="auto"/>
+        <w:rPr>
+          <w:rFonts w:ascii="Arial" w:hAnsi="Arial" w:cs="Arial"/>
+        </w:rPr>
+      </w:pPr>
+      <w:r>
+        <w:rPr>
+          <w:rFonts w:ascii="Arial" w:hAnsi="Arial" w:cs="Arial"/>
+        </w:rPr>
+        <w:t>{</w:t>
+      </w:r>
+      <w:r>
+        <w:rPr>
+          <w:rFonts w:ascii="Arial" w:hAnsi="Arial" w:cs="Arial"/>
+        </w:rPr>
+        <w:t>FIRMA_</w:t>
+      </w:r>
+      <w:r>
+        <w:rPr>
+          <w:rFonts w:ascii="Arial" w:hAnsi="Arial" w:cs="Arial"/>
+        </w:rPr>
+        <w:t>ADRESSE}</w:t>
+      </w:r>
+    </w:p>
+    <w:p>
+      <w:pPr>
+        <w:spacing w:after="0" w:line="240" w:lineRule="auto"/>
+        <w:rPr>
+          <w:rFonts w:ascii="Arial" w:hAnsi="Arial" w:cs="Arial"/>
+        </w:rPr>
+      </w:pPr>
+      <w:r>
+        <w:rPr>
+          <w:rFonts w:ascii="Arial" w:hAnsi="Arial" w:cs="Arial"/>
+        </w:rPr>
+        <w:t>{</w:t>
+      </w:r>
+      <w:r>
+        <w:rPr>
+          <w:rFonts w:ascii="Arial" w:hAnsi="Arial" w:cs="Arial"/>
+        </w:rPr>
+        <w:t>FIRMA_PLZ_ORT</w:t>
+      </w:r>
+      <w:r>
+        <w:rPr>
+          <w:rFonts w:ascii="Arial" w:hAnsi="Arial" w:cs="Arial"/>
+        </w:rPr>
+        <w:t>}</w:t>
+      </w:r>
+    </w:p>
+    <w:p>
+      <w:pPr>
+        <w:spacing w:after="0" w:line="240" w:lineRule="auto"/>
+        <w:rPr>
+          <w:rFonts w:ascii="Arial" w:hAnsi="Arial" w:cs="Arial"/>
+        </w:rPr>
+      </w:pPr>
+      <w:r>
+        <w:rPr>
+          <w:rFonts w:ascii="Arial" w:hAnsi="Arial" w:cs="Arial"/>
+        </w:rPr>
+        <w:t xml:space="preserve">ATU: </w:t>
+      </w:r>
+      <w:r>
+        <w:rPr>
+          <w:rFonts w:ascii="Arial" w:hAnsi="Arial" w:cs="Arial"/>
+        </w:rPr>
+        <w:t>{</w:t>
+      </w:r>
+      <w:r>
+        <w:rPr>
+          <w:rFonts w:ascii="Arial" w:hAnsi="Arial" w:cs="Arial"/>
+        </w:rPr>
+        <w:t>ATU</w:t>
+      </w:r>
+      <w:r>
+        <w:rPr>
+          <w:rFonts w:ascii="Arial" w:hAnsi="Arial" w:cs="Arial"/>
+        </w:rPr>
+        <w:t>}</w:t>
       </w:r>
     </w:p>
     <w:p>
@@ -190,85 +236,9 @@
       </w:r>
       <w:r>
         <w:rPr>
-          <w:rFonts w:ascii="Arial" w:eastAsiaTheme="minorHAnsi" w:hAnsi="Arial" w:cs="Arial"/>
-          <w:bCs/>
-          <w:kern w:val="0"/>
-          <w:sz w:val="20"/>
-          <w:szCs w:val="20"/>
-        </w:rPr>
-        <w:t>{</w:t>
-      </w:r>
-      <w:r>
-        <w:rPr>
-          <w:rFonts w:ascii="Arial" w:eastAsiaTheme="minorHAnsi" w:hAnsi="Arial" w:cs="Arial"/>
-          <w:bCs/>
-          <w:kern w:val="0"/>
-          <w:sz w:val="20"/>
-          <w:szCs w:val="20"/>
-        </w:rPr>
-        <w:t>INKREMENT</w:t>
-      </w:r>
-      <w:r>
-        <w:rPr>
-          <w:rFonts w:ascii="Arial" w:eastAsiaTheme="minorHAnsi" w:hAnsi="Arial" w:cs="Arial"/>
-          <w:bCs/>
-          <w:kern w:val="0"/>
-          <w:sz w:val="20"/>
-          <w:szCs w:val="20"/>
-        </w:rPr>
-        <w:t>}</w:t>
-      </w:r>
-      <w:r>
-        <w:rPr>
-          <w:rFonts w:ascii="Arial" w:eastAsiaTheme="minorHAnsi" w:hAnsi="Arial" w:cs="Arial"/>
-          <w:bCs/>
-          <w:kern w:val="0"/>
-          <w:sz w:val="20"/>
-          <w:szCs w:val="20"/>
-        </w:rPr>
-        <w:t xml:space="preserve"> </w:t>
-      </w:r>
-      <w:r>
-        <w:rPr>
-          <w:rFonts w:ascii="Arial" w:hAnsi="Arial" w:cs="Arial"/>
-        </w:rPr>
-        <w:t>/</w:t>
-      </w:r>
-      <w:r>
-        <w:rPr>
-          <w:rFonts w:ascii="Arial" w:hAnsi="Arial" w:cs="Arial"/>
-        </w:rPr>
-        <w:t xml:space="preserve"> </w:t>
-      </w:r>
-      <w:r>
-        <w:rPr>
-          <w:rFonts w:ascii="Arial" w:eastAsiaTheme="minorHAnsi" w:hAnsi="Arial" w:cs="Arial"/>
-          <w:bCs/>
-          <w:kern w:val="0"/>
-          <w:sz w:val="20"/>
-          <w:szCs w:val="20"/>
-        </w:rPr>
-        <w:t>{</w:t>
-      </w:r>
-      <w:r>
-        <w:rPr>
-          <w:rFonts w:ascii="Arial" w:eastAsiaTheme="minorHAnsi" w:hAnsi="Arial" w:cs="Arial"/>
-          <w:bCs/>
-          <w:kern w:val="0"/>
-          <w:sz w:val="20"/>
-          <w:szCs w:val="20"/>
-        </w:rPr>
-        <w:t>JAHR</w:t>
-      </w:r>
-      <w:r>
-        <w:rPr>
-          <w:rFonts w:ascii="Arial" w:eastAsiaTheme="minorHAnsi" w:hAnsi="Arial" w:cs="Arial"/>
-          <w:bCs/>
-          <w:kern w:val="0"/>
-          <w:sz w:val="20"/>
-          <w:szCs w:val="20"/>
-        </w:rPr>
-        <w:t>}</w:t>
+          <w:rFonts w:ascii="Arial" w:hAnsi="Arial" w:cs="Arial"/>
+        </w:rPr>
+        <w:t>{RECHNUNGSNUMMER}</w:t>
       </w:r>
     </w:p>
     <w:p>
@@ -882,136 +852,6 @@
           <w:szCs w:val="20"/>
         </w:rPr>
       </w:pPr>
-    </w:p>
-    <w:p>
-      <w:pPr>
-        <w:tabs>
-          <w:tab w:val="left" w:pos="6096"/>
-          <w:tab w:val="right" w:pos="9214"/>
-        </w:tabs>
-        <w:suppressAutoHyphens w:val="0"/>
-        <w:autoSpaceDE w:val="0"/>
-        <w:adjustRightInd w:val="0"/>
-        <w:spacing w:after="0" w:line="240" w:lineRule="auto"/>
-        <w:rPr>
-          <w:rFonts w:ascii="Arial" w:eastAsiaTheme="minorHAnsi" w:hAnsi="Arial" w:cs="Arial"/>
-          <w:b/>
-          <w:kern w:val="0"/>
-          <w:sz w:val="20"/>
-          <w:szCs w:val="20"/>
-        </w:rPr>
-      </w:pPr>
-    </w:p>
-    <w:p>
-      <w:pPr>
-        <w:tabs>
-          <w:tab w:val="left" w:pos="6096"/>
-          <w:tab w:val="right" w:pos="9214"/>
-        </w:tabs>
-        <w:suppressAutoHyphens w:val="0"/>
-        <w:autoSpaceDE w:val="0"/>
-        <w:adjustRightInd w:val="0"/>
-        <w:spacing w:after="0" w:line="240" w:lineRule="auto"/>
-        <w:rPr>
-          <w:rFonts w:ascii="Arial" w:eastAsiaTheme="minorHAnsi" w:hAnsi="Arial" w:cs="Arial"/>
-          <w:b/>
-          <w:kern w:val="0"/>
-          <w:sz w:val="20"/>
-          <w:szCs w:val="20"/>
-        </w:rPr>
-      </w:pPr>
-    </w:p>
-    <w:p>
-      <w:pPr>
-        <w:tabs>
-          <w:tab w:val="left" w:pos="6096"/>
-          <w:tab w:val="right" w:pos="9214"/>
-        </w:tabs>
-        <w:suppressAutoHyphens w:val="0"/>
-        <w:autoSpaceDE w:val="0"/>
-        <w:adjustRightInd w:val="0"/>
-        <w:spacing w:after="0" w:line="240" w:lineRule="auto"/>
-        <w:rPr>
-          <w:rFonts w:ascii="Arial" w:eastAsiaTheme="minorHAnsi" w:hAnsi="Arial" w:cs="Arial"/>
-          <w:b/>
-          <w:kern w:val="0"/>
-          <w:sz w:val="20"/>
-          <w:szCs w:val="20"/>
-        </w:rPr>
-      </w:pPr>
-    </w:p>
-    <w:p>
-      <w:pPr>
-        <w:tabs>
-          <w:tab w:val="left" w:pos="6096"/>
-          <w:tab w:val="right" w:pos="9214"/>
-        </w:tabs>
-        <w:suppressAutoHyphens w:val="0"/>
-        <w:autoSpaceDE w:val="0"/>
-        <w:adjustRightInd w:val="0"/>
-        <w:spacing w:after="0" w:line="240" w:lineRule="auto"/>
-        <w:rPr>
-          <w:rFonts w:ascii="Arial" w:eastAsiaTheme="minorHAnsi" w:hAnsi="Arial" w:cs="Arial"/>
-          <w:b/>
-          <w:kern w:val="0"/>
-          <w:sz w:val="20"/>
-          <w:szCs w:val="20"/>
-        </w:rPr>
-      </w:pPr>
-    </w:p>
-    <w:p>
-      <w:pPr>
-        <w:tabs>
-          <w:tab w:val="right" w:pos="1560"/>
-          <w:tab w:val="left" w:pos="1843"/>
-          <w:tab w:val="left" w:pos="2694"/>
-          <w:tab w:val="right" w:pos="7230"/>
-          <w:tab w:val="right" w:pos="9214"/>
-        </w:tabs>
-        <w:spacing w:after="0" w:line="240" w:lineRule="auto"/>
-        <w:rPr>
-          <w:rFonts w:ascii="Arial" w:hAnsi="Arial" w:cs="Arial"/>
-          <w:b/>
-          <w:sz w:val="20"/>
-          <w:szCs w:val="20"/>
-        </w:rPr>
-      </w:pPr>
-    </w:p>
-    <w:p>
-      <w:pPr>
-        <w:tabs>
-          <w:tab w:val="right" w:pos="1560"/>
-          <w:tab w:val="left" w:pos="1843"/>
-          <w:tab w:val="left" w:pos="2694"/>
-          <w:tab w:val="right" w:pos="7230"/>
-          <w:tab w:val="right" w:pos="9214"/>
-        </w:tabs>
-        <w:spacing w:after="0" w:line="240" w:lineRule="auto"/>
-        <w:rPr>
-          <w:rFonts w:ascii="Arial" w:hAnsi="Arial" w:cs="Arial"/>
-          <w:b/>
-          <w:sz w:val="20"/>
-          <w:szCs w:val="20"/>
-        </w:rPr>
-      </w:pPr>
-      <w:r>
-        <w:rPr>
-          <w:rFonts w:ascii="Arial" w:hAnsi="Arial" w:cs="Arial"/>
-          <w:b/>
-          <w:sz w:val="20"/>
-          <w:szCs w:val="20"/>
-        </w:rPr>
-        <w:t>ACHTUNG: Wir möchten auf unsere neue Bankverbindung hinweisen!!!</w:t>
-      </w:r>
-      <w:r>
-        <w:rPr>
-          <w:rFonts w:ascii="Arial" w:hAnsi="Arial" w:cs="Arial"/>
-          <w:b/>
-          <w:sz w:val="20"/>
-          <w:szCs w:val="20"/>
-        </w:rPr>
-        <w:tab/>
-      </w:r>
     </w:p>
     <w:p/>
     <w:sectPr>

</xml_diff>